<commit_message>
Update Group 10 UI assignment document
</commit_message>
<xml_diff>
--- a/assignment/Group10_UI_Assignment.docx
+++ b/assignment/Group10_UI_Assignment.docx
@@ -14,21 +14,6 @@
         <w:rPr>
           <w:rFonts w:ascii="Times New Roman" w:hAnsi="Times New Roman" w:cs="Times New Roman"/>
         </w:rPr>
-        <w:t>Group 10</w:t>
-      </w:r>
-    </w:p>
-    <w:p>
-      <w:pPr>
-        <w:spacing w:line="360" w:lineRule="auto"/>
-        <w:jc w:val="both"/>
-        <w:rPr>
-          <w:rFonts w:ascii="Times New Roman" w:hAnsi="Times New Roman" w:cs="Times New Roman"/>
-        </w:rPr>
-      </w:pPr>
-      <w:r>
-        <w:rPr>
-          <w:rFonts w:ascii="Times New Roman" w:hAnsi="Times New Roman" w:cs="Times New Roman"/>
-        </w:rPr>
         <w:t>Online Examination Portal UI</w:t>
       </w:r>
     </w:p>
@@ -59,22 +44,13 @@
         <w:rPr>
           <w:rFonts w:ascii="Times New Roman" w:hAnsi="Times New Roman" w:cs="Times New Roman"/>
         </w:rPr>
-        <w:t>ARIHIHIKWIZA OSCAR (Reg: 2024/U/MMU/BCS/00064)</w:t>
-      </w:r>
-    </w:p>
-    <w:p>
-      <w:pPr>
-        <w:spacing w:line="360" w:lineRule="auto"/>
-        <w:jc w:val="both"/>
-        <w:rPr>
-          <w:rFonts w:ascii="Times New Roman" w:hAnsi="Times New Roman" w:cs="Times New Roman"/>
-        </w:rPr>
-      </w:pPr>
-      <w:r>
-        <w:rPr>
-          <w:rFonts w:ascii="Times New Roman" w:hAnsi="Times New Roman" w:cs="Times New Roman"/>
-        </w:rPr>
-        <w:t>OPIO LAMECK (Reg: 2024/U/MMU/BCS/00055)</w:t>
+        <w:t>GROUP 10</w:t>
+      </w:r>
+      <w:r>
+        <w:rPr>
+          <w:rFonts w:ascii="Times New Roman" w:hAnsi="Times New Roman" w:cs="Times New Roman"/>
+        </w:rPr>
+        <w:t xml:space="preserve"> </w:t>
       </w:r>
     </w:p>
     <w:p>
@@ -257,22 +233,22 @@
         <w:rPr>
           <w:rFonts w:ascii="Times New Roman" w:hAnsi="Times New Roman" w:cs="Times New Roman"/>
         </w:rPr>
+        <w:t>1. Introduction and chosen system</w:t>
+      </w:r>
+    </w:p>
+    <w:p>
+      <w:pPr>
+        <w:spacing w:line="360" w:lineRule="auto"/>
+        <w:jc w:val="both"/>
+        <w:rPr>
+          <w:rFonts w:ascii="Times New Roman" w:hAnsi="Times New Roman" w:cs="Times New Roman"/>
+        </w:rPr>
+      </w:pPr>
+      <w:r>
+        <w:rPr>
+          <w:rFonts w:ascii="Times New Roman" w:hAnsi="Times New Roman" w:cs="Times New Roman"/>
+        </w:rPr>
         <w:lastRenderedPageBreak/>
-        <w:t>1. Introduction and chosen system</w:t>
-      </w:r>
-    </w:p>
-    <w:p>
-      <w:pPr>
-        <w:spacing w:line="360" w:lineRule="auto"/>
-        <w:jc w:val="both"/>
-        <w:rPr>
-          <w:rFonts w:ascii="Times New Roman" w:hAnsi="Times New Roman" w:cs="Times New Roman"/>
-        </w:rPr>
-      </w:pPr>
-      <w:r>
-        <w:rPr>
-          <w:rFonts w:ascii="Times New Roman" w:hAnsi="Times New Roman" w:cs="Times New Roman"/>
-        </w:rPr>
         <w:t xml:space="preserve">The chosen real system is the </w:t>
       </w:r>
       <w:proofErr w:type="spellStart"/>
@@ -422,22 +398,22 @@
         <w:rPr>
           <w:rFonts w:ascii="Times New Roman" w:hAnsi="Times New Roman" w:cs="Times New Roman"/>
         </w:rPr>
+        <w:t>Affordances and feedback</w:t>
+      </w:r>
+    </w:p>
+    <w:p>
+      <w:pPr>
+        <w:spacing w:line="360" w:lineRule="auto"/>
+        <w:jc w:val="both"/>
+        <w:rPr>
+          <w:rFonts w:ascii="Times New Roman" w:hAnsi="Times New Roman" w:cs="Times New Roman"/>
+        </w:rPr>
+      </w:pPr>
+      <w:r>
+        <w:rPr>
+          <w:rFonts w:ascii="Times New Roman" w:hAnsi="Times New Roman" w:cs="Times New Roman"/>
+        </w:rPr>
         <w:lastRenderedPageBreak/>
-        <w:t>Affordances and feedback</w:t>
-      </w:r>
-    </w:p>
-    <w:p>
-      <w:pPr>
-        <w:spacing w:line="360" w:lineRule="auto"/>
-        <w:jc w:val="both"/>
-        <w:rPr>
-          <w:rFonts w:ascii="Times New Roman" w:hAnsi="Times New Roman" w:cs="Times New Roman"/>
-        </w:rPr>
-      </w:pPr>
-      <w:r>
-        <w:rPr>
-          <w:rFonts w:ascii="Times New Roman" w:hAnsi="Times New Roman" w:cs="Times New Roman"/>
-        </w:rPr>
         <w:t>Affordance 1: the Start Quiz button clearly suggests that clicking it begins the assessment. Affordance 2: the answer radio buttons clearly suggest that options can be selected. Feedback 1: the timer shows remaining time and indicates the quiz is active. Feedback 2: the progress bar gives users visible progress awareness. Missing feedback: the system does not strongly confirm whether the answer has been saved before submission, and the final submission step could be more explicit.</w:t>
       </w:r>
     </w:p>
@@ -601,22 +577,22 @@
         <w:rPr>
           <w:rFonts w:ascii="Times New Roman" w:hAnsi="Times New Roman" w:cs="Times New Roman"/>
         </w:rPr>
+        <w:t>Concise | 4/5 | The interface keeps the flow focused and avoids unnecessary clutter, especially on the quiz screen.</w:t>
+      </w:r>
+    </w:p>
+    <w:p>
+      <w:pPr>
+        <w:spacing w:line="360" w:lineRule="auto"/>
+        <w:jc w:val="both"/>
+        <w:rPr>
+          <w:rFonts w:ascii="Times New Roman" w:hAnsi="Times New Roman" w:cs="Times New Roman"/>
+        </w:rPr>
+      </w:pPr>
+      <w:r>
+        <w:rPr>
+          <w:rFonts w:ascii="Times New Roman" w:hAnsi="Times New Roman" w:cs="Times New Roman"/>
+        </w:rPr>
         <w:lastRenderedPageBreak/>
-        <w:t>Concise | 4/5 | The interface keeps the flow focused and avoids unnecessary clutter, especially on the quiz screen.</w:t>
-      </w:r>
-    </w:p>
-    <w:p>
-      <w:pPr>
-        <w:spacing w:line="360" w:lineRule="auto"/>
-        <w:jc w:val="both"/>
-        <w:rPr>
-          <w:rFonts w:ascii="Times New Roman" w:hAnsi="Times New Roman" w:cs="Times New Roman"/>
-        </w:rPr>
-      </w:pPr>
-      <w:r>
-        <w:rPr>
-          <w:rFonts w:ascii="Times New Roman" w:hAnsi="Times New Roman" w:cs="Times New Roman"/>
-        </w:rPr>
         <w:t>Familiar | 5/5 | The layout follows familiar patterns such as login forms, dashboard cards, and radio-button answer choices.</w:t>
       </w:r>
     </w:p>
@@ -752,28 +728,22 @@
         <w:rPr>
           <w:rFonts w:ascii="Times New Roman" w:hAnsi="Times New Roman" w:cs="Times New Roman"/>
         </w:rPr>
-        <w:t xml:space="preserve">Rule 1: Consistency and standards. The portal keeps consistent design patterns across screens. Rule 2: Offer informative feedback. The timer and progress bar are useful, but answer-saving feedback is weak. Rule 3: Prevent errors. Final submission should require confirmation to avoid </w:t>
-      </w:r>
+        <w:t>Rule 1: Consistency and standards. The portal keeps consistent design patterns across screens. Rule 2: Offer informative feedback. The timer and progress bar are useful, but answer-saving feedback is weak. Rule 3: Prevent errors. Final submission should require confirmation to avoid accidental completion. Rule 4: Reduce short-term memory load. The one-question-at-a-time design reduces mental load and is appropriate for an exam interface.</w:t>
+      </w:r>
+    </w:p>
+    <w:p>
+      <w:pPr>
+        <w:spacing w:line="360" w:lineRule="auto"/>
+        <w:jc w:val="both"/>
+        <w:rPr>
+          <w:rFonts w:ascii="Times New Roman" w:hAnsi="Times New Roman" w:cs="Times New Roman"/>
+        </w:rPr>
+      </w:pPr>
       <w:r>
         <w:rPr>
           <w:rFonts w:ascii="Times New Roman" w:hAnsi="Times New Roman" w:cs="Times New Roman"/>
         </w:rPr>
         <w:lastRenderedPageBreak/>
-        <w:t>accidental completion. Rule 4: Reduce short-term memory load. The one-question-at-a-time design reduces mental load and is appropriate for an exam interface.</w:t>
-      </w:r>
-    </w:p>
-    <w:p>
-      <w:pPr>
-        <w:spacing w:line="360" w:lineRule="auto"/>
-        <w:jc w:val="both"/>
-        <w:rPr>
-          <w:rFonts w:ascii="Times New Roman" w:hAnsi="Times New Roman" w:cs="Times New Roman"/>
-        </w:rPr>
-      </w:pPr>
-      <w:r>
-        <w:rPr>
-          <w:rFonts w:ascii="Times New Roman" w:hAnsi="Times New Roman" w:cs="Times New Roman"/>
-        </w:rPr>
         <w:t>B4. Mistakes and trends</w:t>
       </w:r>
     </w:p>
@@ -894,43 +864,37 @@
         <w:rPr>
           <w:rFonts w:ascii="Times New Roman" w:hAnsi="Times New Roman" w:cs="Times New Roman"/>
         </w:rPr>
-        <w:t>The key design screen would be the quiz-taking page with a timer at the top, question number in the middle, answer options below, and a clear final submission button at the end. The visual metaphor is the examination desk, and the interaction style is direct manipulation with form-</w:t>
-      </w:r>
+        <w:t>The key design screen would be the quiz-taking page with a timer at the top, question number in the middle, answer options below, and a clear final submission button at the end. The visual metaphor is the examination desk, and the interaction style is direct manipulation with form-based input. Two visible affordances would be the Start Quiz button and the answer option selection buttons.</w:t>
+      </w:r>
+    </w:p>
+    <w:p>
+      <w:pPr>
+        <w:spacing w:line="360" w:lineRule="auto"/>
+        <w:jc w:val="both"/>
+        <w:rPr>
+          <w:rFonts w:ascii="Times New Roman" w:hAnsi="Times New Roman" w:cs="Times New Roman"/>
+        </w:rPr>
+      </w:pPr>
+      <w:r>
+        <w:rPr>
+          <w:rFonts w:ascii="Times New Roman" w:hAnsi="Times New Roman" w:cs="Times New Roman"/>
+        </w:rPr>
+        <w:t>Evaluate</w:t>
+      </w:r>
+    </w:p>
+    <w:p>
+      <w:pPr>
+        <w:spacing w:line="360" w:lineRule="auto"/>
+        <w:jc w:val="both"/>
+        <w:rPr>
+          <w:rFonts w:ascii="Times New Roman" w:hAnsi="Times New Roman" w:cs="Times New Roman"/>
+        </w:rPr>
+      </w:pPr>
       <w:r>
         <w:rPr>
           <w:rFonts w:ascii="Times New Roman" w:hAnsi="Times New Roman" w:cs="Times New Roman"/>
         </w:rPr>
         <w:lastRenderedPageBreak/>
-        <w:t>based input. Two visible affordances would be the Start Quiz button and the answer option selection buttons.</w:t>
-      </w:r>
-    </w:p>
-    <w:p>
-      <w:pPr>
-        <w:spacing w:line="360" w:lineRule="auto"/>
-        <w:jc w:val="both"/>
-        <w:rPr>
-          <w:rFonts w:ascii="Times New Roman" w:hAnsi="Times New Roman" w:cs="Times New Roman"/>
-        </w:rPr>
-      </w:pPr>
-      <w:r>
-        <w:rPr>
-          <w:rFonts w:ascii="Times New Roman" w:hAnsi="Times New Roman" w:cs="Times New Roman"/>
-        </w:rPr>
-        <w:t>Evaluate</w:t>
-      </w:r>
-    </w:p>
-    <w:p>
-      <w:pPr>
-        <w:spacing w:line="360" w:lineRule="auto"/>
-        <w:jc w:val="both"/>
-        <w:rPr>
-          <w:rFonts w:ascii="Times New Roman" w:hAnsi="Times New Roman" w:cs="Times New Roman"/>
-        </w:rPr>
-      </w:pPr>
-      <w:r>
-        <w:rPr>
-          <w:rFonts w:ascii="Times New Roman" w:hAnsi="Times New Roman" w:cs="Times New Roman"/>
-        </w:rPr>
         <w:t>I would test the low-fidelity sketch with five students using a short task: log in, find the quiz, answer a question, and submit. I would measure task success, time taken, number of errors, and user satisfaction. I would check two heuristics first: visibility of system status and error prevention.</w:t>
       </w:r>
     </w:p>
@@ -1065,7 +1029,6 @@
         <w:rPr>
           <w:rFonts w:ascii="Times New Roman" w:hAnsi="Times New Roman" w:cs="Times New Roman"/>
         </w:rPr>
-        <w:lastRenderedPageBreak/>
         <w:t xml:space="preserve">Note: The assignment was evaluated using the live </w:t>
       </w:r>
       <w:proofErr w:type="spellStart"/>

</xml_diff>